<commit_message>
Arbeitszeugnis: Erfolgszahlen ergaenzt (10 auf 40 Prozent), China als Tueroeffner, Liefertreue praezisiert
Co-Authored-By: Claude Opus 5 <noreply@anthropic.com>
Claude-Session: https://claude.ai/code/session_016iVS7eqEpUkCmggocDnEow
</commit_message>
<xml_diff>
--- a/zeugnis/Arbeitszeugnis_Stefan_Oliver_Maier.docx
+++ b/zeugnis/Arbeitszeugnis_Stefan_Oliver_Maier.docx
@@ -385,7 +385,7 @@
           <w:sz w:val="22"/>
           <w:szCs w:val="22"/>
         </w:rPr>
-        <w:t xml:space="preserve">Herr Maier verfügte über ein außergewöhnlich fundiertes und breites Fachwissen auf dem Gebiet der maschenbildenden Verfahren, das er in der täglichen Praxis stets sicher und zielgerichtet einsetzte. Seine ausgeprägte Produkt-, Markt- und Branchenkenntnis, insbesondere in der Kettenwirk- und Nähwirktechnik, machte ihn zu einem gefragten Ansprechpartner für Kunden, Vertriebspartner und Fachbereiche gleichermaßen. Neue technische und marktseitige Entwicklungen verfolgte er aufmerksam und erweiterte sein Wissen kontinuierlich aus eigenem Antrieb.</w:t>
+        <w:t xml:space="preserve">Herr Maier verfügte über ein außergewöhnlich fundiertes und breites Fachwissen auf dem Gebiet der maschenbildenden Verfahren, das er in der täglichen Praxis stets sicher und zielgerichtet einsetzte. Seine ausgeprägte Produkt-, Markt- und Branchenkenntnis, insbesondere in der Kettenwirk- und Nähwirktechnik – in der bis zu 10.000 Nadeln gleichzeitig im Eingriff stehen und in ihrer Gleichmäßigkeit exakt mit den übrigen Wirkelementen harmonieren müssen –, machte ihn zu einem gefragten Ansprechpartner für Kunden, Vertriebspartner und Fachbereiche gleichermaßen. Neue technische und marktseitige Entwicklungen verfolgte er aufmerksam und erweiterte sein Wissen kontinuierlich aus eigenem Antrieb.</w:t>
       </w:r>
     </w:p>
     <w:p>
@@ -441,62 +441,21 @@
           <w:sz w:val="22"/>
           <w:szCs w:val="22"/>
         </w:rPr>
-        <w:t xml:space="preserve">Eine herausragende Leistung erbrachte Herr Maier bei der Integration der SAXONIA TEXTILE PARTS GmbH in die KERN-LIEBERS TEXTILE GMBH, deren vertriebsseitige Steuerung er maßgeblich verantwortete. Er entschied über die Fortführung des Produktportfolios am neuen Standort, stimmte die zur Absicherung der Lieferfähigkeit erforderlichen Sicherheitsbestände ab und verantwortete die Überführung sämtlicher Kundenbeziehungen und Stammdaten in die Strukturen und Systeme (SAP) der aufnehmenden Gesellschaft. Darüber hinaus stellte er durch die Schulung der Mitarbeitenden am Standort Schramberg den vollständigen Transfer des Produkt- und Prozesswissens sicher. Die Verlagerung verlief ohne Beeinträchtigung der Liefertreue gegenüber unseren Kunden. </w:t>
-      </w:r>
-      <w:r>
-        <w:rPr>
-          <w:rFonts w:ascii="Arial" w:cs="Arial" w:eastAsia="Arial" w:hAnsi="Arial"/>
-          <w:b/>
-          <w:bCs/>
-          <w:color w:val="C00000"/>
-          <w:sz w:val="22"/>
-          <w:szCs w:val="22"/>
-        </w:rPr>
-        <w:t xml:space="preserve">[Satz nur, wenn zutreffend]</w:t>
-      </w:r>
-    </w:p>
-    <w:p>
-      <w:pPr>
-        <w:spacing w:after="240" w:line="276"/>
-        <w:jc w:val="both"/>
-      </w:pPr>
-      <w:r>
-        <w:rPr>
-          <w:rFonts w:ascii="Arial" w:cs="Arial" w:eastAsia="Arial" w:hAnsi="Arial"/>
-          <w:sz w:val="22"/>
-          <w:szCs w:val="22"/>
-        </w:rPr>
-        <w:t xml:space="preserve">Besonders hervorzuheben ist ferner, dass es Herrn Maier gelang, das Geschäft außerhalb des OEM-Kanals nachhaltig auszubauen und dadurch die Abhängigkeit von einzelnen Großkunden spürbar zu verringern. </w:t>
-      </w:r>
-      <w:r>
-        <w:rPr>
-          <w:rFonts w:ascii="Arial" w:cs="Arial" w:eastAsia="Arial" w:hAnsi="Arial"/>
-          <w:b/>
-          <w:bCs/>
-          <w:color w:val="C00000"/>
-          <w:sz w:val="22"/>
-          <w:szCs w:val="22"/>
-        </w:rPr>
-        <w:t xml:space="preserve">[Zahl ergänzen]</w:t>
-      </w:r>
-      <w:r>
-        <w:rPr>
-          <w:rFonts w:ascii="Arial" w:cs="Arial" w:eastAsia="Arial" w:hAnsi="Arial"/>
-          <w:sz w:val="22"/>
-          <w:szCs w:val="22"/>
-        </w:rPr>
-        <w:t xml:space="preserve"> Darüber hinaus erschloss er unserem Unternehmen den Zugang zu neu aufkommenden Textilmaschinenherstellern in Asien und baute dort tragfähige Geschäftsbeziehungen auf – ein Erfolg, der angesichts der in diesen Märkten ausgeprägten Lieferantenpräferenzen besondere Anerkennung verdient. </w:t>
-      </w:r>
-      <w:r>
-        <w:rPr>
-          <w:rFonts w:ascii="Arial" w:cs="Arial" w:eastAsia="Arial" w:hAnsi="Arial"/>
-          <w:b/>
-          <w:bCs/>
-          <w:color w:val="C00000"/>
-          <w:sz w:val="22"/>
-          <w:szCs w:val="22"/>
-        </w:rPr>
-        <w:t xml:space="preserve">[Zahl ergänzen]</w:t>
+        <w:t xml:space="preserve">Eine herausragende Leistung erbrachte Herr Maier bei der Integration der SAXONIA TEXTILE PARTS GmbH in die KERN-LIEBERS TEXTILE GMBH, deren vertriebsseitige Steuerung er maßgeblich verantwortete. Er entschied über die Fortführung des Produktportfolios am neuen Standort, stimmte die zur Absicherung der Lieferfähigkeit erforderlichen Sicherheitsbestände ab und verantwortete die Überführung sämtlicher Kundenbeziehungen und Stammdaten in die Strukturen und Systeme (SAP) der aufnehmenden Gesellschaft. Darüber hinaus stellte er durch die Schulung der Mitarbeitenden am Standort Schramberg den vollständigen Transfer des Produkt- und Prozesswissens sicher. Durch seine vorausschauende Planung der Fertigungs- und Bevorratungsmengen trug er maßgeblich dazu bei, dass die Lieferfähigkeit gegenüber unseren Kunden während der gesamten Verlagerung gesichert blieb.</w:t>
+      </w:r>
+    </w:p>
+    <w:p>
+      <w:pPr>
+        <w:spacing w:after="240" w:line="276"/>
+        <w:jc w:val="both"/>
+      </w:pPr>
+      <w:r>
+        <w:rPr>
+          <w:rFonts w:ascii="Arial" w:cs="Arial" w:eastAsia="Arial" w:hAnsi="Arial"/>
+          <w:sz w:val="22"/>
+          <w:szCs w:val="22"/>
+        </w:rPr>
+        <w:t xml:space="preserve">Besonders hervorzuheben ist ferner, dass es Herrn Maier gelang, den Umsatzanteil außerhalb des OEM-Kanals von rund 10 % auf rund 40 % zu steigern und damit die Abhängigkeit von einzelnen Großkunden deutlich zu verringern. Maßgeblich hierfür war der gezielte Ausbau des Endkundengeschäfts, insbesondere in China, der zugleich den Zugang zu den dortigen Textilmaschinenherstellern eröffnete: Den Kundenkreis in diesem Segment erweiterte Herr Maier von einem – dem Marktführer – auf sieben Hersteller. Dieser Erfolg ist angesichts der in diesen Märkten ausgeprägten Lieferantenpräferenzen bemerkenswert; er beruhte maßgeblich auf der genauen Kenntnis der markt- und anwendungsseitigen Anforderungen sowie der technischen Eigenschaften unserer Produkte, die Herr Maier in die Gespräche einbrachte.</w:t>
       </w:r>
     </w:p>
     <w:p>
@@ -557,12 +516,7 @@
     </w:p>
     <w:p>
       <w:pPr>
-        <w:spacing w:after="360"/>
-      </w:pPr>
-    </w:p>
-    <w:p>
-      <w:pPr>
-        <w:spacing w:after="360"/>
+        <w:spacing w:after="360" w:before="480"/>
       </w:pPr>
       <w:r>
         <w:rPr>

</xml_diff>

<commit_message>
Arbeitszeugnis: Projektabsatz (OEM-Kooperation, CRM-App, B2B-Portal) als Geruest ergaenzt
Co-Authored-By: Claude Opus 5 <noreply@anthropic.com>
Claude-Session: https://claude.ai/code/session_016iVS7eqEpUkCmggocDnEow
</commit_message>
<xml_diff>
--- a/zeugnis/Arbeitszeugnis_Stefan_Oliver_Maier.docx
+++ b/zeugnis/Arbeitszeugnis_Stefan_Oliver_Maier.docx
@@ -456,6 +456,20 @@
           <w:szCs w:val="22"/>
         </w:rPr>
         <w:t xml:space="preserve">Besonders hervorzuheben ist ferner, dass es Herrn Maier gelang, den Umsatzanteil außerhalb des OEM-Kanals von rund 10 % auf rund 40 % zu steigern und damit die Abhängigkeit von einzelnen Großkunden deutlich zu verringern. Maßgeblich hierfür war der gezielte Ausbau des Endkundengeschäfts, insbesondere in China, der zugleich den Zugang zu den dortigen Textilmaschinenherstellern eröffnete: Den Kundenkreis in diesem Segment erweiterte Herr Maier von einem – dem Marktführer – auf sieben Hersteller. Dieser Erfolg ist angesichts der in diesen Märkten ausgeprägten Lieferantenpräferenzen bemerkenswert; er beruhte maßgeblich auf der genauen Kenntnis der markt- und anwendungsseitigen Anforderungen sowie der technischen Eigenschaften unserer Produkte, die Herr Maier in die Gespräche einbrachte.</w:t>
+      </w:r>
+    </w:p>
+    <w:p>
+      <w:pPr>
+        <w:spacing w:after="240" w:line="276"/>
+        <w:jc w:val="both"/>
+      </w:pPr>
+      <w:r>
+        <w:rPr>
+          <w:rFonts w:ascii="Arial" w:cs="Arial" w:eastAsia="Arial" w:hAnsi="Arial"/>
+          <w:sz w:val="22"/>
+          <w:szCs w:val="22"/>
+        </w:rPr>
+        <w:t xml:space="preserve">Über sein Tagesgeschäft hinaus brachte sich Herr Maier in mehreren bereichsübergreifenden Projekten ein. Er baute die Zusammenarbeit mit einem führenden Textilmaschinenhersteller zu einer strategischen Kooperation aus [DETAIL OEM-KOOPERATION]. Ferner initiierte und konzipierte er eine eigene CRM-Anwendung, mit der Kundenbedürfnisse systematisch erfasst und für die Vertriebs- und Produktplanung nutzbar gemacht werden [DETAIL CRM]. Darüber hinaus unterstützte er maßgeblich den Aufbau des neuen B2B-Portals mit integriertem Onlineshop und Händlerfunktion [DETAIL PORTAL].</w:t>
       </w:r>
     </w:p>
     <w:p>

</xml_diff>

<commit_message>
Arbeitszeugnis: OEM-Partnerschaft und CRM-Eigenentwicklung ausformuliert
</commit_message>
<xml_diff>
--- a/zeugnis/Arbeitszeugnis_Stefan_Oliver_Maier.docx
+++ b/zeugnis/Arbeitszeugnis_Stefan_Oliver_Maier.docx
@@ -469,7 +469,49 @@
           <w:sz w:val="22"/>
           <w:szCs w:val="22"/>
         </w:rPr>
-        <w:t xml:space="preserve">Über sein Tagesgeschäft hinaus brachte sich Herr Maier in mehreren bereichsübergreifenden Projekten ein. Er baute die Zusammenarbeit mit einem führenden Textilmaschinenhersteller zu einer strategischen Kooperation aus [DETAIL OEM-KOOPERATION]. Ferner initiierte und konzipierte er eine eigene CRM-Anwendung, mit der Kundenbedürfnisse systematisch erfasst und für die Vertriebs- und Produktplanung nutzbar gemacht werden [DETAIL CRM]. Darüber hinaus unterstützte er maßgeblich den Aufbau des neuen B2B-Portals mit integriertem Onlineshop und Händlerfunktion [DETAIL PORTAL].</w:t>
+        <w:t xml:space="preserve">Über sein Tagesgeschäft hinaus brachte sich Herr Maier in mehreren bereichsübergreifenden Projekten ein.</w:t>
+      </w:r>
+    </w:p>
+    <w:p>
+      <w:pPr>
+        <w:spacing w:after="240" w:line="276"/>
+        <w:jc w:val="both"/>
+      </w:pPr>
+      <w:r>
+        <w:rPr>
+          <w:rFonts w:ascii="Arial" w:cs="Arial" w:eastAsia="Arial" w:hAnsi="Arial"/>
+          <w:sz w:val="22"/>
+          <w:szCs w:val="22"/>
+        </w:rPr>
+        <w:t xml:space="preserve">Mit dem marktführenden Textilmaschinenhersteller baute er die bestehende Geschäftsbeziehung zu einer strategischen Partnerschaft aus, die in einem Kooperationsvertrag, einer engen technischen Zusammenarbeit sowie in gemeinsam finanzierten Produktionsanlagen an unserem Standort mündete. Diese Partnerschaft sicherte das Geschäft langfristig ab, führte zu zusätzlichem Umsatz und festigte unsere technische Marktführerschaft.</w:t>
+      </w:r>
+    </w:p>
+    <w:p>
+      <w:pPr>
+        <w:spacing w:after="240" w:line="276"/>
+        <w:jc w:val="both"/>
+      </w:pPr>
+      <w:r>
+        <w:rPr>
+          <w:rFonts w:ascii="Arial" w:cs="Arial" w:eastAsia="Arial" w:hAnsi="Arial"/>
+          <w:sz w:val="22"/>
+          <w:szCs w:val="22"/>
+        </w:rPr>
+        <w:t xml:space="preserve">Da sich das konzernweit vorgegebene CRM-System nicht auf die besonderen Anforderungen unseres Geschäfts zuschneiden ließ, konzipierte und realisierte Herr Maier auf Basis von Microsoft Power Apps eine eigene Vertriebsanwendung. Sie führt Kundenstammdaten, den Maschinenpark unserer Kunden, die Bewertung der Kundenqualität, Wettbewerbsinformationen sowie Besuchsberichte und Vertriebsaktivitäten in einem Werkzeug zusammen und ermöglicht es so, Bedarfe und Potenziale systematisch abzuleiten. Auch unsere Handelspartner band er in die Pflege der Daten und die Bearbeitung von Leads ein. Damit schuf er ohne nennenswerte Investitionen eine passgenaue Lösung, die heute eine wesentliche Grundlage der Vertriebs- und Absatzplanung bildet.</w:t>
+      </w:r>
+    </w:p>
+    <w:p>
+      <w:pPr>
+        <w:spacing w:after="240" w:line="276"/>
+        <w:jc w:val="both"/>
+      </w:pPr>
+      <w:r>
+        <w:rPr>
+          <w:rFonts w:ascii="Arial" w:cs="Arial" w:eastAsia="Arial" w:hAnsi="Arial"/>
+          <w:sz w:val="22"/>
+          <w:szCs w:val="22"/>
+        </w:rPr>
+        <w:t xml:space="preserve">Darüber hinaus unterstützte er maßgeblich den Aufbau des neuen B2B-Portals mit integriertem Onlineshop und Händlerfunktion. [DETAIL PORTAL]</w:t>
       </w:r>
     </w:p>
     <w:p>

</xml_diff>

<commit_message>
Zeugnis: Preisdurchsetzung, weltweite Neukunden, Schulung und Kollegenrueckhalt ergaenzt
</commit_message>
<xml_diff>
--- a/zeugnis/Arbeitszeugnis_Stefan_Oliver_Maier.docx
+++ b/zeugnis/Arbeitszeugnis_Stefan_Oliver_Maier.docx
@@ -176,7 +176,7 @@
           <w:sz w:val="22"/>
           <w:szCs w:val="22"/>
         </w:rPr>
-        <w:t xml:space="preserve">die Betreuung und Weiterentwicklung der Schlüsselkunden einschließlich der Verhandlung von Preisen, Konditionen und Rahmenverträgen,</w:t>
+        <w:t xml:space="preserve">die Betreuung und Weiterentwicklung der Schlüsselkunden einschließlich der Verhandlung von Preisen, Konditionen und Rahmenverträgen sowie der Freigabe der Angebote für diese Kunden,</w:t>
       </w:r>
     </w:p>
     <w:p>
@@ -290,6 +290,44 @@
           <w:sz w:val="22"/>
           <w:szCs w:val="22"/>
         </w:rPr>
+        <w:t xml:space="preserve">die technische und vertriebliche Schulung der Mitarbeitenden unserer Niederlassungen sowie unserer Landesvertretungen und Handelspartner einschließlich der Einarbeitung neuer Vertriebsmitarbeitender,</w:t>
+      </w:r>
+    </w:p>
+    <w:p>
+      <w:pPr>
+        <w:pStyle w:val="ListParagraph"/>
+        <w:numPr>
+          <w:ilvl w:val="0"/>
+          <w:numId w:val="2"/>
+        </w:numPr>
+        <w:spacing w:after="80" w:line="276"/>
+        <w:jc w:val="both"/>
+      </w:pPr>
+      <w:r>
+        <w:rPr>
+          <w:rFonts w:ascii="Arial" w:cs="Arial" w:eastAsia="Arial" w:hAnsi="Arial"/>
+          <w:sz w:val="22"/>
+          <w:szCs w:val="22"/>
+        </w:rPr>
+        <w:t xml:space="preserve">die Bewertung von Kundenanforderungen und deren Einsteuerung in die Produktentwicklung,</w:t>
+      </w:r>
+    </w:p>
+    <w:p>
+      <w:pPr>
+        <w:pStyle w:val="ListParagraph"/>
+        <w:numPr>
+          <w:ilvl w:val="0"/>
+          <w:numId w:val="2"/>
+        </w:numPr>
+        <w:spacing w:after="80" w:line="276"/>
+        <w:jc w:val="both"/>
+      </w:pPr>
+      <w:r>
+        <w:rPr>
+          <w:rFonts w:ascii="Arial" w:cs="Arial" w:eastAsia="Arial" w:hAnsi="Arial"/>
+          <w:sz w:val="22"/>
+          <w:szCs w:val="22"/>
+        </w:rPr>
         <w:t xml:space="preserve">die Repräsentation des Unternehmens auf internationalen Fachmessen und bei Kunden weltweit.</w:t>
       </w:r>
     </w:p>
@@ -446,7 +484,7 @@
           <w:sz w:val="22"/>
           <w:szCs w:val="22"/>
         </w:rPr>
-        <w:t xml:space="preserve">Als Führungskraft überzeugte Herr Maier durch einen kooperativen und zugleich zielorientierten Führungsstil. Er informierte seine Mitarbeitenden umfassend, delegierte Aufgaben und Verantwortung sachgerecht und förderte die fachliche wie persönliche Entwicklung seines Teams nachhaltig. Die von ihm geführten Mitarbeitenden – auch über Standorte und Ländergrenzen hinweg – schätzten ihn als verlässliche, motivierende und jederzeit ansprechbare Führungspersönlichkeit. Sein Verantwortungsbereich war stets hervorragend organisiert.</w:t>
+        <w:t xml:space="preserve">Als Führungskraft überzeugte Herr Maier durch einen kooperativen und zugleich zielorientierten Führungsstil. Er informierte seine Mitarbeitenden umfassend, delegierte Aufgaben und Verantwortung sachgerecht und förderte die fachliche wie persönliche Entwicklung seines Teams nachhaltig. Die von ihm geführten Mitarbeitenden – auch über Standorte und Ländergrenzen hinweg – schätzten ihn als verlässliche, motivierende und jederzeit ansprechbare Führungspersönlichkeit. Sein Verantwortungsbereich war stets hervorragend organisiert. Auch über seinen eigenen Bereich hinaus war er bei schwierigen Entscheidungen ein verlässlicher Ansprechpartner für seine Kolleginnen und Kollegen, dessen Rat und Urteil im gesamten Unternehmen geschätzt wurden.</w:t>
       </w:r>
     </w:p>
     <w:p>
@@ -474,7 +512,7 @@
           <w:sz w:val="22"/>
           <w:szCs w:val="22"/>
         </w:rPr>
-        <w:t xml:space="preserve">Besonders hervorzuheben ist ferner, dass es Herrn Maier gelang, den Umsatzanteil außerhalb des OEM-Kanals von rund 10 % auf rund 40 % zu steigern und damit die Abhängigkeit von einzelnen Großkunden deutlich zu verringern. Maßgeblich hierfür war der gezielte Ausbau des Endkundengeschäfts, insbesondere in China, der zugleich den Zugang zu den dortigen Textilmaschinenherstellern eröffnete: Den Kundenkreis in diesem Segment erweiterte Herr Maier von einem – dem Marktführer – auf sieben Hersteller. Dieser Erfolg ist angesichts der in diesen Märkten ausgeprägten Lieferantenpräferenzen bemerkenswert; er beruhte maßgeblich auf der genauen Kenntnis der markt- und anwendungsseitigen Anforderungen sowie der technischen Eigenschaften unserer Produkte, die Herr Maier in die Gespräche einbrachte.</w:t>
+        <w:t xml:space="preserve">Besonders hervorzuheben ist ferner, dass es Herrn Maier gelang, den Umsatzanteil außerhalb des OEM-Kanals von rund 10 % auf rund 40 % zu steigern und damit die Abhängigkeit von einzelnen Großkunden deutlich zu verringern. Maßgeblich hierfür war der gezielte Ausbau des Endkundengeschäfts, insbesondere in China, der zugleich den Zugang zu den dortigen Textilmaschinenherstellern eröffnete: Den Kundenkreis in diesem Segment erweiterte Herr Maier von einem – dem Marktführer – auf sieben Hersteller. Dieser Erfolg ist angesichts der in diesen Märkten ausgeprägten Lieferantenpräferenzen bemerkenswert; er beruhte maßgeblich auf der genauen Kenntnis der markt- und anwendungsseitigen Anforderungen sowie der technischen Eigenschaften unserer Produkte, die Herr Maier in die Gespräche einbrachte. Neukunden gewann er darüber hinaus in den Vereinigten Staaten, in Brasilien, Japan, Indien und in Europa. In einem von erheblichen Kostensteigerungen geprägten Marktumfeld setzte er zudem die notwendigen Preisanpassungen konsequent durch – auch gegenüber unserem umsatzstärksten Kunden – und sicherte damit die Ertragskraft seines Bereichs nachhaltig ab.</w:t>
       </w:r>
     </w:p>
     <w:p>

</xml_diff>

<commit_message>
Zeugnis: Review-Punkte umgesetzt, Projektabsaetze nach vorn
</commit_message>
<xml_diff>
--- a/zeugnis/Arbeitszeugnis_Stefan_Oliver_Maier.docx
+++ b/zeugnis/Arbeitszeugnis_Stefan_Oliver_Maier.docx
@@ -281,6 +281,34 @@
           <w:sz w:val="22"/>
           <w:szCs w:val="22"/>
         </w:rPr>
+        <w:t xml:space="preserve">Über sein Tagesgeschäft hinaus prägte Herr Maier mehrere bereichsübergreifende Projekte. Die weltweite Vereinheitlichung der Customer-Service-Prozesse führte er als eigenständiges Projekt erfolgreich zum Abschluss. Mit dem marktführenden Textilmaschinenhersteller baute er die Geschäftsbeziehung zu einer strategischen Partnerschaft aus, die in einem Kooperationsvertrag, enger technischer Zusammenarbeit und gemeinsam finanzierten Produktionsanlagen an unserem Standort mündete, das Geschäft langfristig absicherte und unsere technische Marktführerschaft festigte.</w:t>
+      </w:r>
+    </w:p>
+    <w:p>
+      <w:pPr>
+        <w:spacing w:after="240" w:line="276"/>
+        <w:jc w:val="both"/>
+      </w:pPr>
+      <w:r>
+        <w:rPr>
+          <w:rFonts w:ascii="Arial" w:cs="Arial" w:eastAsia="Arial" w:hAnsi="Arial"/>
+          <w:sz w:val="22"/>
+          <w:szCs w:val="22"/>
+        </w:rPr>
+        <w:t xml:space="preserve">Besonderes Engagement zeigte er bei der Digitalisierung des Vertriebs. Um die Bedürfnisse unserer Kunden systematisch zu erfassen und für die Vertriebssteuerung nutzbar zu machen, initiierte er eine eigene Vertriebsanwendung auf Basis von Microsoft Power Apps und verantwortete deren fachliche Konzeption; die technische Umsetzung erfolgte durch unsere IT nach den von ihm erarbeiteten Anforderungen. Die Anwendung führt Kundenstammdaten, den Maschinenpark und die Bewertung unserer Kunden, Wettbewerbsinformationen sowie Besuchsberichte und Vertriebsaktivitäten zusammen, bindet unsere Handelspartner in Datenpflege und Leadbearbeitung ein und steht dem Vertrieb seit dem Rollout mobil zur Verfügung. Am Aufbau des neuen B2B-Portals mit Onlineshop und Händlerfunktion wirkte er von der Anbieterauswahl über das Lastenheft bis in die Detailfragen der Umsetzung maßgeblich mit; seine langjährige Kundenerfahrung, seine vertriebliche Expertise und seine genaue Kenntnis unserer SAP-Systeme waren dabei eine wesentliche Entscheidungsgrundlage.</w:t>
+      </w:r>
+    </w:p>
+    <w:p>
+      <w:pPr>
+        <w:spacing w:after="240" w:line="276"/>
+        <w:jc w:val="both"/>
+      </w:pPr>
+      <w:r>
+        <w:rPr>
+          <w:rFonts w:ascii="Arial" w:cs="Arial" w:eastAsia="Arial" w:hAnsi="Arial"/>
+          <w:sz w:val="22"/>
+          <w:szCs w:val="22"/>
+        </w:rPr>
         <w:t xml:space="preserve">Herr Maier verfügte über ein außergewöhnlich fundiertes Fachwissen auf dem Gebiet der maschenbildenden Verfahren, das er stets sicher und zielgerichtet einsetzte. Seine ausgeprägte Produkt-, Markt- und Branchenkenntnis, insbesondere in der Kettenwirk- und Nähwirktechnik – in der bis zu 10.000 Nadeln gleichzeitig im Eingriff stehen und in ihrer Gleichmäßigkeit exakt mit den übrigen Wirkelementen harmonieren müssen –, machte ihn zu einem gefragten Ansprechpartner für Kunden, Vertriebspartner und Fachbereiche gleichermaßen.</w:t>
       </w:r>
     </w:p>
@@ -295,21 +323,21 @@
           <w:sz w:val="22"/>
           <w:szCs w:val="22"/>
         </w:rPr>
-        <w:t xml:space="preserve">Er zeichnete sich durch eine außerordentlich hohe Einsatzbereitschaft und ausgeprägtes unternehmerisches Denken aus. Chancen und Risiken erkannte er frühzeitig, entwickelte daraus eigeninitiativ tragfähige Konzepte und setzte diese konsequent um. Seine Arbeitsweise war stets planvoll, strukturiert und äußerst sorgfältig; auch unter hoher Belastung arbeitete er ruhig, überlegt und mit gleichbleibend hoher Qualität. In Verhandlungen überzeugte er durch souveränes Auftreten, ausgeprägtes Verhandlungsgeschick und ein sicheres Gespür für die Interessenlage seiner Gesprächspartner – im nationalen wie im internationalen Umfeld.</w:t>
-      </w:r>
-    </w:p>
-    <w:p>
-      <w:pPr>
-        <w:spacing w:after="240" w:line="276"/>
-        <w:jc w:val="both"/>
-      </w:pPr>
-      <w:r>
-        <w:rPr>
-          <w:rFonts w:ascii="Arial" w:cs="Arial" w:eastAsia="Arial" w:hAnsi="Arial"/>
-          <w:sz w:val="22"/>
-          <w:szCs w:val="22"/>
-        </w:rPr>
-        <w:t xml:space="preserve">Als Führungskraft überzeugte Herr Maier durch einen kooperativen und zugleich zielorientierten Führungsstil. Er delegierte Aufgaben und Verantwortung sachgerecht, förderte die fachliche wie persönliche Entwicklung seines Teams nachhaltig und wurde von seinen Mitarbeitenden – auch über Standorte und Ländergrenzen hinweg – als verlässliche und motivierende Führungspersönlichkeit geschätzt. Auch über seinen eigenen Bereich hinaus war er bei schwierigen Entscheidungen ein verlässlicher Ansprechpartner für seine Kolleginnen und Kollegen, dessen Rat und Urteil im gesamten Unternehmen Gewicht hatten.</w:t>
+        <w:t xml:space="preserve">Er zeichnete sich durch eine außerordentlich hohe Einsatzbereitschaft und ausgeprägtes unternehmerisches Denken aus. Chancen und Risiken erkannte er frühzeitig, entwickelte daraus eigeninitiativ tragfähige Konzepte und setzte diese konsequent um. Seine Arbeitsweise war stets planvoll, strukturiert und äußerst sorgfältig; auch unter hoher Belastung arbeitete er ruhig, überlegt und mit gleichbleibend hoher Qualität. In Verhandlungen überzeugte er durch souveränes Auftreten, ausgeprägtes Verhandlungsgeschick und ein sicheres Gespür für die Interessenlage seiner Gesprächspartner – im nationalen wie im internationalen Umfeld. Herr Maier war jederzeit zuverlässig, loyal und – insbesondere in der Wahrnehmung seiner Preis- und Ergebnisverantwortung – absolut vertrauenswürdig.</w:t>
+      </w:r>
+    </w:p>
+    <w:p>
+      <w:pPr>
+        <w:spacing w:after="240" w:line="276"/>
+        <w:jc w:val="both"/>
+      </w:pPr>
+      <w:r>
+        <w:rPr>
+          <w:rFonts w:ascii="Arial" w:cs="Arial" w:eastAsia="Arial" w:hAnsi="Arial"/>
+          <w:sz w:val="22"/>
+          <w:szCs w:val="22"/>
+        </w:rPr>
+        <w:t xml:space="preserve">Als Führungskraft überzeugte Herr Maier durch einen kooperativen und zugleich zielorientierten Führungsstil. Er delegierte Aufgaben und Verantwortung sachgerecht, förderte die fachliche wie persönliche Entwicklung seines Teams nachhaltig und wurde von seinen Mitarbeitenden – auch über Standorte und Ländergrenzen hinweg – als verlässliche und motivierende Führungspersönlichkeit geschätzt. Als Vorgesetzter wurde er jederzeit voll anerkannt; seine Führungsleistung war stets vorbildlich. Auch über seinen eigenen Bereich hinaus war er bei schwierigen Entscheidungen ein verlässlicher Ansprechpartner für seine Kolleginnen und Kollegen, dessen Rat und Urteil im gesamten Unternehmen Gewicht hatten.</w:t>
       </w:r>
     </w:p>
     <w:p>
@@ -337,35 +365,7 @@
           <w:sz w:val="22"/>
           <w:szCs w:val="22"/>
         </w:rPr>
-        <w:t xml:space="preserve">Hervorzuheben ist ferner, dass Herr Maier den Umsatzanteil außerhalb des OEM-Kanals von rund 10 % auf rund 40 % steigerte und damit die Abhängigkeit von einzelnen Großkunden deutlich verringerte. Maßgeblich hierfür war der gezielte Ausbau des Endkundengeschäfts in China, der zugleich den Zugang zu den dortigen Maschinenherstellern eröffnete: Den Kundenkreis in diesem Segment erweiterte er von einem – dem Marktführer – auf sieben Hersteller, was angesichts der dort ausgeprägten Lieferantenpräferenzen besondere Anerkennung verdient. Weitere Neukunden gewann er in den Vereinigten Staaten, in Brasilien, Japan, Indien und in Europa. In einem von erheblichen Kostensteigerungen geprägten Marktumfeld setzte er zudem die notwendigen Preisanpassungen konsequent durch – auch gegenüber unserem umsatzstärksten Kunden – und sicherte so die Ertragskraft seines Bereichs.</w:t>
-      </w:r>
-    </w:p>
-    <w:p>
-      <w:pPr>
-        <w:spacing w:after="240" w:line="276"/>
-        <w:jc w:val="both"/>
-      </w:pPr>
-      <w:r>
-        <w:rPr>
-          <w:rFonts w:ascii="Arial" w:cs="Arial" w:eastAsia="Arial" w:hAnsi="Arial"/>
-          <w:sz w:val="22"/>
-          <w:szCs w:val="22"/>
-        </w:rPr>
-        <w:t xml:space="preserve">Über sein Tagesgeschäft hinaus prägte Herr Maier mehrere bereichsübergreifende Projekte. Die weltweite Vereinheitlichung der Customer-Service-Prozesse führte er als eigenständiges Projekt erfolgreich zum Abschluss. Mit dem marktführenden Textilmaschinenhersteller baute er die Geschäftsbeziehung zu einer strategischen Partnerschaft aus, die in einem Kooperationsvertrag, enger technischer Zusammenarbeit und gemeinsam finanzierten Produktionsanlagen an unserem Standort mündete, das Geschäft langfristig absicherte und unsere technische Marktführerschaft festigte.</w:t>
-      </w:r>
-    </w:p>
-    <w:p>
-      <w:pPr>
-        <w:spacing w:after="240" w:line="276"/>
-        <w:jc w:val="both"/>
-      </w:pPr>
-      <w:r>
-        <w:rPr>
-          <w:rFonts w:ascii="Arial" w:cs="Arial" w:eastAsia="Arial" w:hAnsi="Arial"/>
-          <w:sz w:val="22"/>
-          <w:szCs w:val="22"/>
-        </w:rPr>
-        <w:t xml:space="preserve">Besonderes Engagement zeigte er bei der Digitalisierung des Vertriebs. Da sich das konzernweit vorgegebene CRM-System nicht auf die Anforderungen unseres Geschäfts zuschneiden ließ, initiierte er eine eigene Vertriebsanwendung auf Basis von Microsoft Power Apps und verantwortete deren fachliche Konzeption; die technische Umsetzung erfolgte durch unsere IT nach den von ihm erarbeiteten Anforderungen. Die Anwendung führt Kundenstammdaten, den Maschinenpark und die Bewertung unserer Kunden, Wettbewerbsinformationen sowie Besuchsberichte und Vertriebsaktivitäten zusammen, bindet unsere Handelspartner in Datenpflege und Leadbearbeitung ein und steht dem Vertrieb seit dem Rollout mobil zur Verfügung. Am Aufbau des neuen B2B-Portals mit Onlineshop und Händlerfunktion wirkte er von der Anbieterauswahl über das Lastenheft bis in die Detailfragen der Umsetzung maßgeblich mit; seine langjährige Kundenerfahrung, seine vertriebliche Expertise und seine genaue Kenntnis unserer SAP-Systeme waren dabei eine wesentliche Entscheidungsgrundlage.</w:t>
+        <w:t xml:space="preserve">Hervorzuheben ist ferner, dass Herr Maier den Umsatzanteil außerhalb des OEM-Kanals von rund 10 % auf rund 40 % steigerte und damit die Abhängigkeit von einzelnen Großkunden deutlich verringerte. Maßgeblich hierfür war der gezielte Ausbau des Endkundengeschäfts in China, der zugleich den Zugang zu den dortigen Maschinenherstellern eröffnete: Den Kundenkreis in diesem Segment erweiterte er von einem – dem Marktführer – auf sieben Hersteller, und dies in einem Marktumfeld, das von ausgeprägten regionalen Lieferantenpräferenzen geprägt ist. Weitere Neukunden gewann er in den Vereinigten Staaten, in Brasilien, Japan, Indien und in Europa. In einem von erheblichen Kostensteigerungen geprägten Marktumfeld setzte er zudem die notwendigen Preisanpassungen konsequent durch – auch gegenüber unserem umsatzstärksten Kunden – und sicherte so die Ertragskraft seines Bereichs.</w:t>
       </w:r>
     </w:p>
     <w:p>
@@ -393,7 +393,7 @@
           <w:sz w:val="22"/>
           <w:szCs w:val="22"/>
         </w:rPr>
-        <w:t xml:space="preserve">Sein Verhalten gegenüber Vorgesetzten, Mitarbeitenden, Kollegen und Kunden war stets vorbildlich. Aufgrund seiner offenen, verbindlichen und hilfsbereiten Art war er bei allen Beteiligten gleichermaßen anerkannt und geschätzt.</w:t>
+        <w:t xml:space="preserve">Sein Verhalten gegenüber Vorgesetzten, Kollegen, Mitarbeitenden und Kunden war stets vorbildlich. Aufgrund seiner offenen, verbindlichen und hilfsbereiten Art war er bei allen Beteiligten gleichermaßen anerkannt und geschätzt.</w:t>
       </w:r>
     </w:p>
     <w:p>

</xml_diff>

<commit_message>
Zeugnis: Arbeitserfolgsformel, Weiterbildungen und Projektrolle B2B-Portal ergaenzt
</commit_message>
<xml_diff>
--- a/zeugnis/Arbeitszeugnis_Stefan_Oliver_Maier.docx
+++ b/zeugnis/Arbeitszeugnis_Stefan_Oliver_Maier.docx
@@ -295,21 +295,21 @@
           <w:sz w:val="22"/>
           <w:szCs w:val="22"/>
         </w:rPr>
-        <w:t xml:space="preserve">Besonderes Engagement zeigte er bei der Digitalisierung des Vertriebs. Um die Bedürfnisse unserer Kunden systematisch zu erfassen und für die Vertriebssteuerung nutzbar zu machen, initiierte er eine eigene Vertriebsanwendung auf Basis von Microsoft Power Apps und verantwortete deren fachliche Konzeption; die technische Umsetzung erfolgte durch unsere IT nach den von ihm erarbeiteten Anforderungen. Die Anwendung führt Kundenstammdaten, den Maschinenpark und die Bewertung unserer Kunden, Wettbewerbsinformationen sowie Besuchsberichte und Vertriebsaktivitäten zusammen, bindet unsere Handelspartner in Datenpflege und Leadbearbeitung ein und steht dem Vertrieb seit dem Rollout mobil zur Verfügung. Am Aufbau des neuen B2B-Portals mit Onlineshop und Händlerfunktion wirkte er von der Anbieterauswahl über das Lastenheft bis in die Detailfragen der Umsetzung maßgeblich mit; seine langjährige Kundenerfahrung, seine vertriebliche Expertise und seine genaue Kenntnis unserer SAP-Systeme waren dabei eine wesentliche Entscheidungsgrundlage.</w:t>
-      </w:r>
-    </w:p>
-    <w:p>
-      <w:pPr>
-        <w:spacing w:after="240" w:line="276"/>
-        <w:jc w:val="both"/>
-      </w:pPr>
-      <w:r>
-        <w:rPr>
-          <w:rFonts w:ascii="Arial" w:cs="Arial" w:eastAsia="Arial" w:hAnsi="Arial"/>
-          <w:sz w:val="22"/>
-          <w:szCs w:val="22"/>
-        </w:rPr>
-        <w:t xml:space="preserve">Herr Maier verfügte über ein außergewöhnlich fundiertes Fachwissen auf dem Gebiet der maschenbildenden Verfahren, das er stets sicher und zielgerichtet einsetzte. Seine ausgeprägte Produkt-, Markt- und Branchenkenntnis, insbesondere in der Kettenwirk- und Nähwirktechnik – in der bis zu 10.000 Nadeln gleichzeitig im Eingriff stehen und in ihrer Gleichmäßigkeit exakt mit den übrigen Wirkelementen harmonieren müssen –, machte ihn zu einem gefragten Ansprechpartner für Kunden, Vertriebspartner und Fachbereiche gleichermaßen.</w:t>
+        <w:t xml:space="preserve">Besonderes Engagement zeigte er bei der Digitalisierung des Vertriebs. Um die Bedürfnisse unserer Kunden systematisch zu erfassen und für die Vertriebssteuerung nutzbar zu machen, initiierte er eine eigene Vertriebsanwendung auf Basis von Microsoft Power Apps und verantwortete deren fachliche Konzeption; die technische Umsetzung erfolgte durch unsere IT nach den von ihm erarbeiteten Anforderungen. Die Anwendung führt Kundenstammdaten, den Maschinenpark und die Bewertung unserer Kunden, Wettbewerbsinformationen sowie Besuchsberichte und Vertriebsaktivitäten zusammen, bindet unsere Handelspartner in Datenpflege und Leadbearbeitung ein und steht dem Vertrieb seit dem Rollout mobil zur Verfügung. Im Kernteam für den Aufbau des neuen B2B-Portals mit Onlineshop und Händlerfunktion verantwortete er den Bereich Vertrieb – von der Anbieterauswahl über die Erstellung des Lastenhefts bis in die Detailfragen der Umsetzung; seine langjährige Kundenerfahrung, seine vertriebliche Expertise und seine genaue Kenntnis unserer SAP-Systeme waren dabei eine wesentliche Entscheidungsgrundlage.</w:t>
+      </w:r>
+    </w:p>
+    <w:p>
+      <w:pPr>
+        <w:spacing w:after="240" w:line="276"/>
+        <w:jc w:val="both"/>
+      </w:pPr>
+      <w:r>
+        <w:rPr>
+          <w:rFonts w:ascii="Arial" w:cs="Arial" w:eastAsia="Arial" w:hAnsi="Arial"/>
+          <w:sz w:val="22"/>
+          <w:szCs w:val="22"/>
+        </w:rPr>
+        <w:t xml:space="preserve">Herr Maier verfügte über ein außergewöhnlich fundiertes Fachwissen auf dem Gebiet der maschenbildenden Verfahren, das er stets sicher und zielgerichtet einsetzte. Seine ausgeprägte Produkt-, Markt- und Branchenkenntnis, insbesondere in der Kettenwirk- und Nähwirktechnik – in der bis zu 10.000 Nadeln gleichzeitig im Eingriff stehen und in ihrer Gleichmäßigkeit exakt mit den übrigen Wirkelementen harmonieren müssen –, machte ihn zu einem gefragten Ansprechpartner für Kunden, Vertriebspartner und Fachbereiche gleichermaßen. Sein Wissen erweiterte er kontinuierlich und vielfach aus eigenem Antrieb: Er absolvierte das Leadership Development Program der Kern-Liebers Firmengruppe, nahm regelmäßig an Vertriebstrainings und Coachings teil und eignete sich neue digitale Werkzeuge eigeninitiativ an.</w:t>
       </w:r>
     </w:p>
     <w:p>
@@ -379,7 +379,7 @@
           <w:sz w:val="22"/>
           <w:szCs w:val="22"/>
         </w:rPr>
-        <w:t xml:space="preserve">Herr Maier erledigte alle ihm übertragenen Aufgaben stets zu unserer vollsten Zufriedenheit.</w:t>
+        <w:t xml:space="preserve">Die Arbeitsergebnisse von Herrn Maier waren stets von ausgezeichneter Qualität. Er erledigte alle ihm übertragenen Aufgaben stets zu unserer vollsten Zufriedenheit.</w:t>
       </w:r>
     </w:p>
     <w:p>

</xml_diff>

<commit_message>
Zeugnis: Stilueberarbeitung, Einschuebe und Konnektormonotonie entfernt
</commit_message>
<xml_diff>
--- a/zeugnis/Arbeitszeugnis_Stefan_Oliver_Maier.docx
+++ b/zeugnis/Arbeitszeugnis_Stefan_Oliver_Maier.docx
@@ -58,7 +58,7 @@
           <w:sz w:val="22"/>
           <w:szCs w:val="22"/>
         </w:rPr>
-        <w:t xml:space="preserve">Bis zum 31. Januar 2025 verantwortete Herr Maier als Director Sales Warp den weltweiten Vertrieb des Produktbereichs Kettenwirken (Warp) sowie – ebenfalls seit April 2018 – den Vertrieb der im Jahr 2021 integrierten Tochtergesellschaft Naplafa. Zum 1. Februar 2025 wurde ihm zusätzlich die Verantwortung für den Customer Service (Vertriebsinnendienst) sowie – nunmehr auch organisatorisch ausgewiesen – für das Produktmanagement des Bereichs Warp übertragen; zugleich übernahm er die Leitung der gesamten Absatz- und Jahresplanung der Division Textile. In dieser erweiterten Funktion als Director Customer Service und Produktmanager Warp – bei fortbestehender Vertriebsverantwortung für unsere Schlüsselkunden – berichtete er unmittelbar an den Vice President Sales, führte ein Team von sieben Mitarbeitenden disziplinarisch und steuerte fachlich die Vertriebsmitarbeitenden unserer Niederlassungen in den USA, in Indien und in China. Die übrigen Märkte betreute er über ein weltweites Netz aus Landesvertretungen und Handelspartnern, das er auswählte, steuerte und weiterentwickelte. Die Betreuung unserer Schlüsselkunden einschließlich der Preisgestaltung und der Kundenabnahmen nahm er dabei durchgehend persönlich wahr.</w:t>
+        <w:t xml:space="preserve">Bis zum 31. Januar 2025 verantwortete Herr Maier als Director Sales Warp den weltweiten Vertrieb des Produktbereichs Kettenwirken (Warp). Ebenfalls seit April 2018 leitete er den Vertrieb der im Jahr 2021 integrierten Tochtergesellschaft Naplafa. Zum 1. Februar 2025 wurde ihm zusätzlich die Verantwortung für den Customer Service (Vertriebsinnendienst) und, nunmehr auch organisatorisch ausgewiesen, für das Produktmanagement des Bereichs Warp übertragen. Zugleich übernahm er die Leitung der gesamten Absatz- und Jahresplanung der Division Textile. In dieser erweiterten Funktion als Director Customer Service und Produktmanager Warp, bei fortbestehender Vertriebsverantwortung für unsere Schlüsselkunden, berichtete er unmittelbar an den Vice President Sales, führte ein Team von sieben Mitarbeitenden disziplinarisch und steuerte fachlich die Vertriebsmitarbeitenden unserer Niederlassungen in den USA, in Indien und in China. Die übrigen Märkte betreute er über ein weltweites Netz aus Landesvertretungen und Handelspartnern, das er auswählte, steuerte und weiterentwickelte. Die Betreuung unserer Schlüsselkunden mit Preisgestaltung und Kundenabnahmen nahm er dabei durchgehend persönlich wahr.</w:t>
       </w:r>
     </w:p>
     <w:p>
@@ -91,7 +91,7 @@
           <w:sz w:val="22"/>
           <w:szCs w:val="22"/>
         </w:rPr>
-        <w:t xml:space="preserve">die weltweite Umsatz- und Ergebnisverantwortung für den als eigenständiges Profit Center geführten Produktbereich Kettenwirken mit einem Umsatzvolumen von bis zu 27 Mio. Euro jährlich einschließlich Kalkulation und Festlegung der Zielmargen,</w:t>
+        <w:t xml:space="preserve">die weltweite Umsatz- und Ergebnisverantwortung für den als eigenständiges Profit Center geführten Produktbereich Kettenwirken mit einem Umsatzvolumen von bis zu 27 Mio. Euro jährlich, dazu Kalkulation und Festlegung der Zielmargen,</w:t>
       </w:r>
     </w:p>
     <w:p>
@@ -148,7 +148,7 @@
           <w:sz w:val="22"/>
           <w:szCs w:val="22"/>
         </w:rPr>
-        <w:t xml:space="preserve">die Betreuung der Schlüsselkunden einschließlich der Verhandlung von Preisen, Konditionen und Rahmenverträgen sowie der Freigabe der Angebote,</w:t>
+        <w:t xml:space="preserve">die Betreuung der Schlüsselkunden, die Verhandlung von Preisen, Konditionen und Rahmenverträgen sowie die Freigabe der Angebote,</w:t>
       </w:r>
     </w:p>
     <w:p>
@@ -205,7 +205,7 @@
           <w:sz w:val="22"/>
           <w:szCs w:val="22"/>
         </w:rPr>
-        <w:t xml:space="preserve">die Absatz-, Umsatz- und Budgetplanung einschließlich Forecasting und Reporting an die Geschäftsleitung sowie die Jahresplanung des Produktbereichs Wirk für sämtliche Gesellschaften der Division Textile,</w:t>
+        <w:t xml:space="preserve">die Absatz-, Umsatz- und Budgetplanung mit Forecasting und Reporting an die Geschäftsleitung sowie die Jahresplanung des Produktbereichs Wirk für sämtliche Gesellschaften der Division Textile,</w:t>
       </w:r>
     </w:p>
     <w:p>
@@ -243,7 +243,7 @@
           <w:sz w:val="22"/>
           <w:szCs w:val="22"/>
         </w:rPr>
-        <w:t xml:space="preserve">ab Februar 2025 die Leitung des Customer Service (Vertriebsinnendienst) mit sieben Mitarbeitenden einschließlich Auftragsabwicklung, Angebotswesen, Reklamationsbearbeitung sowie der Steuerung und Priorisierung der Liefertermine in Abstimmung mit Produktion und Disposition,</w:t>
+        <w:t xml:space="preserve">ab Februar 2025 die Leitung des Customer Service (Vertriebsinnendienst) mit sieben Mitarbeitenden für Auftragsabwicklung, Angebotswesen, Reklamationsbearbeitung sowie für die Steuerung und Priorisierung der Liefertermine in Abstimmung mit Produktion und Disposition,</w:t>
       </w:r>
     </w:p>
     <w:p>
@@ -281,63 +281,63 @@
           <w:sz w:val="22"/>
           <w:szCs w:val="22"/>
         </w:rPr>
-        <w:t xml:space="preserve">Über sein Tagesgeschäft hinaus prägte Herr Maier mehrere bereichsübergreifende Projekte. Die weltweite Vereinheitlichung der Customer-Service-Prozesse führte er als eigenständiges Projekt erfolgreich zum Abschluss. Mit dem marktführenden Textilmaschinenhersteller baute er die Geschäftsbeziehung zu einer strategischen Partnerschaft aus, die in einem Kooperationsvertrag, enger technischer Zusammenarbeit und gemeinsam finanzierten Produktionsanlagen an unserem Standort mündete, das Geschäft langfristig absicherte und unsere technische Marktführerschaft festigte.</w:t>
-      </w:r>
-    </w:p>
-    <w:p>
-      <w:pPr>
-        <w:spacing w:after="240" w:line="276"/>
-        <w:jc w:val="both"/>
-      </w:pPr>
-      <w:r>
-        <w:rPr>
-          <w:rFonts w:ascii="Arial" w:cs="Arial" w:eastAsia="Arial" w:hAnsi="Arial"/>
-          <w:sz w:val="22"/>
-          <w:szCs w:val="22"/>
-        </w:rPr>
-        <w:t xml:space="preserve">Besonderes Engagement zeigte er bei der Digitalisierung des Vertriebs. Um die Bedürfnisse unserer Kunden systematisch zu erfassen und für die Vertriebssteuerung nutzbar zu machen, initiierte er eine eigene Vertriebsanwendung auf Basis von Microsoft Power Apps und verantwortete deren fachliche Konzeption; die technische Umsetzung erfolgte durch unsere IT nach den von ihm erarbeiteten Anforderungen. Die Anwendung führt Kundenstammdaten, den Maschinenpark und die Bewertung unserer Kunden, Wettbewerbsinformationen sowie Besuchsberichte und Vertriebsaktivitäten zusammen, bindet unsere Handelspartner in Datenpflege und Leadbearbeitung ein und steht dem Vertrieb seit dem Rollout mobil zur Verfügung. Im Kernteam für den Aufbau des neuen B2B-Portals mit Onlineshop und Händlerfunktion verantwortete er den Bereich Vertrieb – von der Anbieterauswahl über die Erstellung des Lastenhefts bis in die Detailfragen der Umsetzung; seine langjährige Kundenerfahrung, seine vertriebliche Expertise und seine genaue Kenntnis unserer SAP-Systeme waren dabei eine wesentliche Entscheidungsgrundlage.</w:t>
-      </w:r>
-    </w:p>
-    <w:p>
-      <w:pPr>
-        <w:spacing w:after="240" w:line="276"/>
-        <w:jc w:val="both"/>
-      </w:pPr>
-      <w:r>
-        <w:rPr>
-          <w:rFonts w:ascii="Arial" w:cs="Arial" w:eastAsia="Arial" w:hAnsi="Arial"/>
-          <w:sz w:val="22"/>
-          <w:szCs w:val="22"/>
-        </w:rPr>
-        <w:t xml:space="preserve">Herr Maier verfügte über ein außergewöhnlich fundiertes Fachwissen auf dem Gebiet der maschenbildenden Verfahren, das er stets sicher und zielgerichtet einsetzte. Seine ausgeprägte Produkt-, Markt- und Branchenkenntnis, insbesondere in der Kettenwirk- und Nähwirktechnik – in der bis zu 10.000 Nadeln gleichzeitig im Eingriff stehen und in ihrer Gleichmäßigkeit exakt mit den übrigen Wirkelementen harmonieren müssen –, machte ihn zu einem gefragten Ansprechpartner für Kunden, Vertriebspartner und Fachbereiche gleichermaßen. Sein Wissen erweiterte er kontinuierlich und vielfach aus eigenem Antrieb: Er absolvierte das Leadership Development Program der Kern-Liebers Firmengruppe, nahm regelmäßig an Vertriebstrainings und Coachings teil und eignete sich neue digitale Werkzeuge eigeninitiativ an.</w:t>
-      </w:r>
-    </w:p>
-    <w:p>
-      <w:pPr>
-        <w:spacing w:after="240" w:line="276"/>
-        <w:jc w:val="both"/>
-      </w:pPr>
-      <w:r>
-        <w:rPr>
-          <w:rFonts w:ascii="Arial" w:cs="Arial" w:eastAsia="Arial" w:hAnsi="Arial"/>
-          <w:sz w:val="22"/>
-          <w:szCs w:val="22"/>
-        </w:rPr>
-        <w:t xml:space="preserve">Er zeichnete sich durch eine außerordentlich hohe Einsatzbereitschaft und ausgeprägtes unternehmerisches Denken aus. Chancen und Risiken erkannte er frühzeitig, entwickelte daraus eigeninitiativ tragfähige Konzepte und setzte diese konsequent um. Seine Arbeitsweise war stets planvoll, strukturiert und äußerst sorgfältig; auch unter hoher Belastung arbeitete er ruhig, überlegt und mit gleichbleibend hoher Qualität. In Verhandlungen überzeugte er durch souveränes Auftreten, ausgeprägtes Verhandlungsgeschick und ein sicheres Gespür für die Interessenlage seiner Gesprächspartner – im nationalen wie im internationalen Umfeld. Herr Maier war jederzeit zuverlässig, loyal und – insbesondere in der Wahrnehmung seiner Preis- und Ergebnisverantwortung – absolut vertrauenswürdig.</w:t>
-      </w:r>
-    </w:p>
-    <w:p>
-      <w:pPr>
-        <w:spacing w:after="240" w:line="276"/>
-        <w:jc w:val="both"/>
-      </w:pPr>
-      <w:r>
-        <w:rPr>
-          <w:rFonts w:ascii="Arial" w:cs="Arial" w:eastAsia="Arial" w:hAnsi="Arial"/>
-          <w:sz w:val="22"/>
-          <w:szCs w:val="22"/>
-        </w:rPr>
-        <w:t xml:space="preserve">Als Führungskraft überzeugte Herr Maier durch einen kooperativen und zugleich zielorientierten Führungsstil. Er delegierte Aufgaben und Verantwortung sachgerecht, förderte die fachliche wie persönliche Entwicklung seines Teams nachhaltig und wurde von seinen Mitarbeitenden – auch über Standorte und Ländergrenzen hinweg – als verlässliche und motivierende Führungspersönlichkeit geschätzt. Als Vorgesetzter wurde er jederzeit voll anerkannt; seine Führungsleistung war stets vorbildlich. Auch über seinen eigenen Bereich hinaus war er bei schwierigen Entscheidungen ein verlässlicher Ansprechpartner für seine Kolleginnen und Kollegen, dessen Rat und Urteil im gesamten Unternehmen Gewicht hatten.</w:t>
+        <w:t xml:space="preserve">Über sein Tagesgeschäft hinaus führte Herr Maier die weltweite Vereinheitlichung der Customer-Service-Prozesse als eigenständiges Projekt erfolgreich zum Abschluss. Mit dem marktführenden Textilmaschinenhersteller baute er die Geschäftsbeziehung zu einer strategischen Partnerschaft aus, die in einem Kooperationsvertrag, enger technischer Zusammenarbeit und gemeinsam finanzierten Produktionsanlagen an unserem Standort mündete. Sie sicherte das Geschäft langfristig ab und festigte unsere technische Marktführerschaft.</w:t>
+      </w:r>
+    </w:p>
+    <w:p>
+      <w:pPr>
+        <w:spacing w:after="240" w:line="276"/>
+        <w:jc w:val="both"/>
+      </w:pPr>
+      <w:r>
+        <w:rPr>
+          <w:rFonts w:ascii="Arial" w:cs="Arial" w:eastAsia="Arial" w:hAnsi="Arial"/>
+          <w:sz w:val="22"/>
+          <w:szCs w:val="22"/>
+        </w:rPr>
+        <w:t xml:space="preserve">Um die Bedürfnisse unserer Kunden systematisch zu erfassen und für die Vertriebssteuerung nutzbar zu machen, initiierte er eine eigene Vertriebsanwendung auf Basis von Microsoft Power Apps und verantwortete deren fachliche Konzeption. Die technische Umsetzung erfolgte durch unsere IT nach den von ihm erarbeiteten Anforderungen. Die Anwendung führt Kundenstammdaten, den Maschinenpark und die Bewertung unserer Kunden, Wettbewerbsinformationen, Besuchsberichte und Vertriebsaktivitäten zusammen, bindet unsere Handelspartner in Datenpflege und Leadbearbeitung ein und steht dem Vertrieb seit dem Rollout mobil zur Verfügung. Im Kernteam für den Aufbau des neuen B2B-Portals mit Onlineshop und Händlerfunktion verantwortete er den Bereich Vertrieb von der Anbieterauswahl über die Erstellung des Lastenhefts bis in die Detailfragen der Umsetzung. Seine langjährige Kundenerfahrung, seine vertriebliche Expertise und seine genaue Kenntnis unserer SAP-Systeme waren dabei eine wesentliche Entscheidungsgrundlage.</w:t>
+      </w:r>
+    </w:p>
+    <w:p>
+      <w:pPr>
+        <w:spacing w:after="240" w:line="276"/>
+        <w:jc w:val="both"/>
+      </w:pPr>
+      <w:r>
+        <w:rPr>
+          <w:rFonts w:ascii="Arial" w:cs="Arial" w:eastAsia="Arial" w:hAnsi="Arial"/>
+          <w:sz w:val="22"/>
+          <w:szCs w:val="22"/>
+        </w:rPr>
+        <w:t xml:space="preserve">Herr Maier verfügte über ein außergewöhnlich fundiertes Fachwissen auf dem Gebiet der maschenbildenden Verfahren, das er stets sicher und zielgerichtet einsetzte. Seine ausgeprägte Produkt-, Markt- und Branchenkenntnis machte ihn zu einem gefragten Ansprechpartner für Kunden, Vertriebspartner und Fachbereiche gleichermaßen. Das gilt besonders für die Kettenwirk- und Nähwirktechnik, in der bis zu 10.000 Nadeln gleichzeitig im Eingriff stehen und in ihrer Gleichmäßigkeit exakt mit den übrigen Wirkelementen harmonieren müssen. Sein Wissen erweiterte er kontinuierlich und vielfach aus eigenem Antrieb: Er absolvierte das Leadership Development Program der Kern-Liebers Firmengruppe, nahm regelmäßig an Vertriebstrainings und Coachings teil und eignete sich neue digitale Werkzeuge eigeninitiativ an.</w:t>
+      </w:r>
+    </w:p>
+    <w:p>
+      <w:pPr>
+        <w:spacing w:after="240" w:line="276"/>
+        <w:jc w:val="both"/>
+      </w:pPr>
+      <w:r>
+        <w:rPr>
+          <w:rFonts w:ascii="Arial" w:cs="Arial" w:eastAsia="Arial" w:hAnsi="Arial"/>
+          <w:sz w:val="22"/>
+          <w:szCs w:val="22"/>
+        </w:rPr>
+        <w:t xml:space="preserve">Er zeichnete sich durch eine außerordentlich hohe Einsatzbereitschaft und ausgeprägtes unternehmerisches Denken aus. Chancen und Risiken erkannte er frühzeitig, entwickelte daraus eigeninitiativ tragfähige Konzepte und setzte diese konsequent um. Seine Arbeitsweise war stets planvoll, strukturiert und äußerst sorgfältig. Auch unter hoher Belastung arbeitete er ruhig, überlegt und mit gleichbleibend hoher Qualität. In Verhandlungen überzeugte er im nationalen wie im internationalen Umfeld durch souveränes Auftreten, ausgeprägtes Verhandlungsgeschick und ein sicheres Gespür für die Interessenlage seiner Gesprächspartner. Gerade in der Wahrnehmung seiner Preis- und Ergebnisverantwortung war Herr Maier jederzeit zuverlässig, loyal und absolut vertrauenswürdig.</w:t>
+      </w:r>
+    </w:p>
+    <w:p>
+      <w:pPr>
+        <w:spacing w:after="240" w:line="276"/>
+        <w:jc w:val="both"/>
+      </w:pPr>
+      <w:r>
+        <w:rPr>
+          <w:rFonts w:ascii="Arial" w:cs="Arial" w:eastAsia="Arial" w:hAnsi="Arial"/>
+          <w:sz w:val="22"/>
+          <w:szCs w:val="22"/>
+        </w:rPr>
+        <w:t xml:space="preserve">Als Führungskraft überzeugte Herr Maier durch einen kooperativen und zugleich zielorientierten Führungsstil. Er delegierte Aufgaben und Verantwortung sachgerecht und förderte die fachliche wie persönliche Entwicklung seines Teams nachhaltig. Seine Mitarbeitenden schätzten ihn auch über Standorte und Ländergrenzen hinweg als verlässliche und motivierende Führungspersönlichkeit. Als Vorgesetzter wurde er jederzeit voll anerkannt, seine Führungsleistung war stets vorbildlich. Auch über seinen eigenen Bereich hinaus war er bei schwierigen Entscheidungen ein verlässlicher Ansprechpartner für seine Kolleginnen und Kollegen, dessen Rat und Urteil im gesamten Unternehmen Gewicht hatten.</w:t>
       </w:r>
     </w:p>
     <w:p>
@@ -365,7 +365,7 @@
           <w:sz w:val="22"/>
           <w:szCs w:val="22"/>
         </w:rPr>
-        <w:t xml:space="preserve">Hervorzuheben ist ferner, dass Herr Maier den Umsatzanteil außerhalb des OEM-Kanals von rund 10 % auf rund 40 % steigerte und damit die Abhängigkeit von einzelnen Großkunden deutlich verringerte. Maßgeblich hierfür war der gezielte Ausbau des Endkundengeschäfts in China, der zugleich den Zugang zu den dortigen Maschinenherstellern eröffnete: Den Kundenkreis in diesem Segment erweiterte er von einem – dem Marktführer – auf sieben Hersteller, und dies in einem Marktumfeld, das von ausgeprägten regionalen Lieferantenpräferenzen geprägt ist. Weitere Neukunden gewann er in den Vereinigten Staaten, in Brasilien, Japan, Indien und in Europa. In einem von erheblichen Kostensteigerungen geprägten Marktumfeld setzte er zudem die notwendigen Preisanpassungen konsequent durch – auch gegenüber unserem umsatzstärksten Kunden – und sicherte so die Ertragskraft seines Bereichs.</w:t>
+        <w:t xml:space="preserve">Hervorzuheben ist ferner, dass Herr Maier den Umsatzanteil außerhalb des OEM-Kanals von rund 10 % auf rund 40 % steigerte und damit die Abhängigkeit von einzelnen Großkunden deutlich verringerte. Maßgeblich hierfür war der gezielte Ausbau des Endkundengeschäfts in China, der zugleich den Zugang zu den dortigen Maschinenherstellern eröffnete: Den Kundenkreis in diesem Segment erweiterte er von einem einzigen Hersteller, dem Marktführer, auf sieben, und dies in einem Markt mit ausgeprägten regionalen Lieferantenpräferenzen. Weitere Neukunden gewann er in den Vereinigten Staaten, in Brasilien, Japan, Indien und in Europa. Als die Kosten erheblich stiegen, setzte er die notwendigen Preisanpassungen konsequent durch, auch gegenüber unserem umsatzstärksten Kunden, und sicherte so die Ertragskraft seines Bereichs.</w:t>
       </w:r>
     </w:p>
     <w:p>
@@ -393,7 +393,7 @@
           <w:sz w:val="22"/>
           <w:szCs w:val="22"/>
         </w:rPr>
-        <w:t xml:space="preserve">Sein Verhalten gegenüber Vorgesetzten, Kollegen, Mitarbeitenden und Kunden war stets vorbildlich. Aufgrund seiner offenen, verbindlichen und hilfsbereiten Art war er bei allen Beteiligten gleichermaßen anerkannt und geschätzt.</w:t>
+        <w:t xml:space="preserve">Sein Verhalten gegenüber Vorgesetzten, Kolleginnen und Kollegen, Mitarbeitenden und Kunden war stets vorbildlich. Aufgrund seiner offenen, verbindlichen und hilfsbereiten Art war er bei allen Beteiligten gleichermaßen anerkannt und geschätzt.</w:t>
       </w:r>
     </w:p>
     <w:p>

</xml_diff>

<commit_message>
Zeugnis: Fachpassagen in die Arbeitgeberperspektive gedreht
</commit_message>
<xml_diff>
--- a/zeugnis/Arbeitszeugnis_Stefan_Oliver_Maier.docx
+++ b/zeugnis/Arbeitszeugnis_Stefan_Oliver_Maier.docx
@@ -295,21 +295,21 @@
           <w:sz w:val="22"/>
           <w:szCs w:val="22"/>
         </w:rPr>
-        <w:t xml:space="preserve">Um die Bedürfnisse unserer Kunden systematisch zu erfassen und für die Vertriebssteuerung nutzbar zu machen, initiierte er eine eigene Vertriebsanwendung auf Basis von Microsoft Power Apps und verantwortete deren fachliche Konzeption. Die technische Umsetzung erfolgte durch unsere IT nach den von ihm erarbeiteten Anforderungen. Die Anwendung führt Kundenstammdaten, den Maschinenpark und die Bewertung unserer Kunden, Wettbewerbsinformationen, Besuchsberichte und Vertriebsaktivitäten zusammen, bindet unsere Handelspartner in Datenpflege und Leadbearbeitung ein und steht dem Vertrieb seit dem Rollout mobil zur Verfügung. Im Kernteam für den Aufbau des neuen B2B-Portals mit Onlineshop und Händlerfunktion verantwortete er den Bereich Vertrieb von der Anbieterauswahl über die Erstellung des Lastenhefts bis in die Detailfragen der Umsetzung. Seine langjährige Kundenerfahrung, seine vertriebliche Expertise und seine genaue Kenntnis unserer SAP-Systeme waren dabei eine wesentliche Entscheidungsgrundlage.</w:t>
-      </w:r>
-    </w:p>
-    <w:p>
-      <w:pPr>
-        <w:spacing w:after="240" w:line="276"/>
-        <w:jc w:val="both"/>
-      </w:pPr>
-      <w:r>
-        <w:rPr>
-          <w:rFonts w:ascii="Arial" w:cs="Arial" w:eastAsia="Arial" w:hAnsi="Arial"/>
-          <w:sz w:val="22"/>
-          <w:szCs w:val="22"/>
-        </w:rPr>
-        <w:t xml:space="preserve">Herr Maier verfügte über ein außergewöhnlich fundiertes Fachwissen auf dem Gebiet der maschenbildenden Verfahren, das er stets sicher und zielgerichtet einsetzte. Seine ausgeprägte Produkt-, Markt- und Branchenkenntnis machte ihn zu einem gefragten Ansprechpartner für Kunden, Vertriebspartner und Fachbereiche gleichermaßen. Das gilt besonders für die Kettenwirk- und Nähwirktechnik, in der bis zu 10.000 Nadeln gleichzeitig im Eingriff stehen und in ihrer Gleichmäßigkeit exakt mit den übrigen Wirkelementen harmonieren müssen. Sein Wissen erweiterte er kontinuierlich und vielfach aus eigenem Antrieb: Er absolvierte das Leadership Development Program der Kern-Liebers Firmengruppe, nahm regelmäßig an Vertriebstrainings und Coachings teil und eignete sich neue digitale Werkzeuge eigeninitiativ an.</w:t>
+        <w:t xml:space="preserve">Um die Bedürfnisse unserer Kunden systematisch zu erfassen und für die Vertriebssteuerung nutzbar zu machen, initiierte er eine eigene Vertriebsanwendung auf Basis von Microsoft Power Apps und verantwortete deren fachliche Konzeption. Die technische Umsetzung erfolgte durch unsere IT nach den von ihm erarbeiteten Anforderungen. Die Anwendung verbindet die Kundendaten mit dem Maschinenpark unserer Kunden, mit Wettbewerbsinformationen und Vertriebsaktivitäten und erlaubt es so, Bedarfe frühzeitig abzuleiten. Sie bindet unsere Handelspartner in Datenpflege und Leadbearbeitung ein und steht dem Vertrieb seit dem Rollout mobil zur Verfügung. Im Kernteam für den Aufbau des neuen B2B-Portals mit Onlineshop und Händlerfunktion verantwortete er den Bereich Vertrieb von der Anbieterauswahl über die Erstellung des Lastenhefts bis in die Detailfragen der Umsetzung. Seine langjährige Kundenerfahrung, seine vertriebliche Expertise und seine genaue Kenntnis unserer SAP-Systeme waren dabei eine wesentliche Entscheidungsgrundlage.</w:t>
+      </w:r>
+    </w:p>
+    <w:p>
+      <w:pPr>
+        <w:spacing w:after="240" w:line="276"/>
+        <w:jc w:val="both"/>
+      </w:pPr>
+      <w:r>
+        <w:rPr>
+          <w:rFonts w:ascii="Arial" w:cs="Arial" w:eastAsia="Arial" w:hAnsi="Arial"/>
+          <w:sz w:val="22"/>
+          <w:szCs w:val="22"/>
+        </w:rPr>
+        <w:t xml:space="preserve">Herr Maier verfügte über ein außergewöhnlich fundiertes Fachwissen auf dem Gebiet der maschenbildenden Verfahren, das er stets sicher und zielgerichtet einsetzte. Seine ausgeprägte Produkt-, Markt- und Branchenkenntnis machte ihn zu einem gefragten Ansprechpartner für Kunden, Vertriebspartner und Fachbereiche gleichermaßen. Die anwendungstechnischen Zusammenhänge der Kettenwirktechnik beherrschte er bis ins Detail, etwa das exakte Zusammenspiel von bis zu 10.000 gleichzeitig im Eingriff stehenden Nadeln mit den übrigen Wirkelementen. Sein Wissen erweiterte er kontinuierlich und vielfach aus eigenem Antrieb: Er absolvierte das Leadership Development Program der Kern-Liebers Firmengruppe, nahm regelmäßig an Vertriebstrainings und Coachings teil und eignete sich neue digitale Werkzeuge eigeninitiativ an.</w:t>
       </w:r>
     </w:p>
     <w:p>

</xml_diff>

<commit_message>
Zeugnis: Layout neu - explizite Dokumentstandards, einfacher Zeilenabstand, Briefkopf nur auf Seite 1
</commit_message>
<xml_diff>
--- a/zeugnis/Arbeitszeugnis_Stefan_Oliver_Maier.docx
+++ b/zeugnis/Arbeitszeugnis_Stefan_Oliver_Maier.docx
@@ -4,7 +4,12 @@
   <w:body>
     <w:p>
       <w:pPr>
-        <w:spacing w:after="480"/>
+        <w:spacing w:after="0" w:line="1250" w:lineRule="exact"/>
+      </w:pPr>
+    </w:p>
+    <w:p>
+      <w:pPr>
+        <w:spacing w:after="300"/>
         <w:jc w:val="center"/>
       </w:pPr>
       <w:r>
@@ -12,16 +17,16 @@
           <w:rFonts w:ascii="Arial" w:cs="Arial" w:eastAsia="Arial" w:hAnsi="Arial"/>
           <w:b/>
           <w:bCs/>
-          <w:spacing w:val="40"/>
-          <w:sz w:val="32"/>
-          <w:szCs w:val="32"/>
+          <w:spacing w:val="30"/>
+          <w:sz w:val="30"/>
+          <w:szCs w:val="30"/>
         </w:rPr>
         <w:t xml:space="preserve">Arbeitszeugnis</w:t>
       </w:r>
     </w:p>
     <w:p>
       <w:pPr>
-        <w:spacing w:after="240" w:line="276"/>
+        <w:spacing w:after="120" w:line="240" w:lineRule="auto"/>
         <w:jc w:val="both"/>
       </w:pPr>
       <w:r>
@@ -35,7 +40,7 @@
     </w:p>
     <w:p>
       <w:pPr>
-        <w:spacing w:after="240" w:line="276"/>
+        <w:spacing w:after="120" w:line="240" w:lineRule="auto"/>
         <w:jc w:val="both"/>
       </w:pPr>
       <w:r>
@@ -49,7 +54,7 @@
     </w:p>
     <w:p>
       <w:pPr>
-        <w:spacing w:after="240" w:line="276"/>
+        <w:spacing w:after="120" w:line="240" w:lineRule="auto"/>
         <w:jc w:val="both"/>
       </w:pPr>
       <w:r>
@@ -63,7 +68,7 @@
     </w:p>
     <w:p>
       <w:pPr>
-        <w:spacing w:after="240" w:line="276"/>
+        <w:spacing w:after="120" w:line="240" w:lineRule="auto"/>
         <w:jc w:val="both"/>
       </w:pPr>
       <w:r>
@@ -82,7 +87,7 @@
           <w:ilvl w:val="0"/>
           <w:numId w:val="2"/>
         </w:numPr>
-        <w:spacing w:after="80" w:line="276"/>
+        <w:spacing w:after="40" w:line="240" w:lineRule="auto"/>
         <w:jc w:val="both"/>
       </w:pPr>
       <w:r>
@@ -101,7 +106,7 @@
           <w:ilvl w:val="0"/>
           <w:numId w:val="2"/>
         </w:numPr>
-        <w:spacing w:after="80" w:line="276"/>
+        <w:spacing w:after="40" w:line="240" w:lineRule="auto"/>
         <w:jc w:val="both"/>
       </w:pPr>
       <w:r>
@@ -120,7 +125,7 @@
           <w:ilvl w:val="0"/>
           <w:numId w:val="2"/>
         </w:numPr>
-        <w:spacing w:after="80" w:line="276"/>
+        <w:spacing w:after="40" w:line="240" w:lineRule="auto"/>
         <w:jc w:val="both"/>
       </w:pPr>
       <w:r>
@@ -139,7 +144,7 @@
           <w:ilvl w:val="0"/>
           <w:numId w:val="2"/>
         </w:numPr>
-        <w:spacing w:after="80" w:line="276"/>
+        <w:spacing w:after="40" w:line="240" w:lineRule="auto"/>
         <w:jc w:val="both"/>
       </w:pPr>
       <w:r>
@@ -158,7 +163,7 @@
           <w:ilvl w:val="0"/>
           <w:numId w:val="2"/>
         </w:numPr>
-        <w:spacing w:after="80" w:line="276"/>
+        <w:spacing w:after="40" w:line="240" w:lineRule="auto"/>
         <w:jc w:val="both"/>
       </w:pPr>
       <w:r>
@@ -177,7 +182,7 @@
           <w:ilvl w:val="0"/>
           <w:numId w:val="2"/>
         </w:numPr>
-        <w:spacing w:after="80" w:line="276"/>
+        <w:spacing w:after="40" w:line="240" w:lineRule="auto"/>
         <w:jc w:val="both"/>
       </w:pPr>
       <w:r>
@@ -196,7 +201,7 @@
           <w:ilvl w:val="0"/>
           <w:numId w:val="2"/>
         </w:numPr>
-        <w:spacing w:after="80" w:line="276"/>
+        <w:spacing w:after="40" w:line="240" w:lineRule="auto"/>
         <w:jc w:val="both"/>
       </w:pPr>
       <w:r>
@@ -215,7 +220,7 @@
           <w:ilvl w:val="0"/>
           <w:numId w:val="2"/>
         </w:numPr>
-        <w:spacing w:after="80" w:line="276"/>
+        <w:spacing w:after="40" w:line="240" w:lineRule="auto"/>
         <w:jc w:val="both"/>
       </w:pPr>
       <w:r>
@@ -234,7 +239,7 @@
           <w:ilvl w:val="0"/>
           <w:numId w:val="2"/>
         </w:numPr>
-        <w:spacing w:after="80" w:line="276"/>
+        <w:spacing w:after="40" w:line="240" w:lineRule="auto"/>
         <w:jc w:val="both"/>
       </w:pPr>
       <w:r>
@@ -253,7 +258,7 @@
           <w:ilvl w:val="0"/>
           <w:numId w:val="2"/>
         </w:numPr>
-        <w:spacing w:after="80" w:line="276"/>
+        <w:spacing w:after="40" w:line="240" w:lineRule="auto"/>
         <w:jc w:val="both"/>
       </w:pPr>
       <w:r>
@@ -267,12 +272,12 @@
     </w:p>
     <w:p>
       <w:pPr>
-        <w:spacing w:after="120"/>
-      </w:pPr>
-    </w:p>
-    <w:p>
-      <w:pPr>
-        <w:spacing w:after="240" w:line="276"/>
+        <w:spacing w:after="60" w:line="120" w:lineRule="exact"/>
+      </w:pPr>
+    </w:p>
+    <w:p>
+      <w:pPr>
+        <w:spacing w:after="120" w:line="240" w:lineRule="auto"/>
         <w:jc w:val="both"/>
       </w:pPr>
       <w:r>
@@ -286,7 +291,7 @@
     </w:p>
     <w:p>
       <w:pPr>
-        <w:spacing w:after="240" w:line="276"/>
+        <w:spacing w:after="120" w:line="240" w:lineRule="auto"/>
         <w:jc w:val="both"/>
       </w:pPr>
       <w:r>
@@ -300,7 +305,7 @@
     </w:p>
     <w:p>
       <w:pPr>
-        <w:spacing w:after="240" w:line="276"/>
+        <w:spacing w:after="120" w:line="240" w:lineRule="auto"/>
         <w:jc w:val="both"/>
       </w:pPr>
       <w:r>
@@ -314,7 +319,7 @@
     </w:p>
     <w:p>
       <w:pPr>
-        <w:spacing w:after="240" w:line="276"/>
+        <w:spacing w:after="120" w:line="240" w:lineRule="auto"/>
         <w:jc w:val="both"/>
       </w:pPr>
       <w:r>
@@ -328,7 +333,7 @@
     </w:p>
     <w:p>
       <w:pPr>
-        <w:spacing w:after="240" w:line="276"/>
+        <w:spacing w:after="120" w:line="240" w:lineRule="auto"/>
         <w:jc w:val="both"/>
       </w:pPr>
       <w:r>
@@ -342,7 +347,7 @@
     </w:p>
     <w:p>
       <w:pPr>
-        <w:spacing w:after="240" w:line="276"/>
+        <w:spacing w:after="120" w:line="240" w:lineRule="auto"/>
         <w:jc w:val="both"/>
       </w:pPr>
       <w:r>
@@ -356,7 +361,7 @@
     </w:p>
     <w:p>
       <w:pPr>
-        <w:spacing w:after="240" w:line="276"/>
+        <w:spacing w:after="120" w:line="240" w:lineRule="auto"/>
         <w:jc w:val="both"/>
       </w:pPr>
       <w:r>
@@ -370,7 +375,7 @@
     </w:p>
     <w:p>
       <w:pPr>
-        <w:spacing w:after="240" w:line="276"/>
+        <w:spacing w:after="120" w:line="240" w:lineRule="auto"/>
         <w:jc w:val="both"/>
       </w:pPr>
       <w:r>
@@ -384,7 +389,7 @@
     </w:p>
     <w:p>
       <w:pPr>
-        <w:spacing w:after="240" w:line="276"/>
+        <w:spacing w:after="120" w:line="240" w:lineRule="auto"/>
         <w:jc w:val="both"/>
       </w:pPr>
       <w:r>
@@ -398,7 +403,7 @@
     </w:p>
     <w:p>
       <w:pPr>
-        <w:spacing w:after="240" w:line="276"/>
+        <w:spacing w:after="120" w:line="240" w:lineRule="auto"/>
         <w:jc w:val="both"/>
       </w:pPr>
       <w:r>
@@ -412,7 +417,7 @@
     </w:p>
     <w:p>
       <w:pPr>
-        <w:spacing w:after="240" w:line="276"/>
+        <w:spacing w:after="120" w:line="240" w:lineRule="auto"/>
         <w:jc w:val="both"/>
       </w:pPr>
       <w:r>
@@ -426,7 +431,7 @@
     </w:p>
     <w:p>
       <w:pPr>
-        <w:spacing w:after="360" w:before="480"/>
+        <w:spacing w:after="300" w:before="300"/>
       </w:pPr>
       <w:r>
         <w:rPr>
@@ -439,7 +444,7 @@
     </w:p>
     <w:p>
       <w:pPr>
-        <w:spacing w:after="960"/>
+        <w:spacing w:after="800"/>
       </w:pPr>
       <w:r>
         <w:rPr>
@@ -454,7 +459,7 @@
     </w:p>
     <w:p>
       <w:pPr>
-        <w:spacing w:after="60"/>
+        <w:spacing w:after="40"/>
       </w:pPr>
       <w:r>
         <w:rPr>
@@ -478,7 +483,7 @@
     </w:p>
     <w:sectPr>
       <w:pgSz w:w="11906" w:h="16838" w:orient="portrait"/>
-      <w:pgMar w:top="2551" w:right="1133" w:bottom="1417" w:left="1417" w:header="708" w:footer="708" w:gutter="0"/>
+      <w:pgMar w:top="1417" w:right="1133" w:bottom="1133" w:left="1417" w:header="708" w:footer="708" w:gutter="0"/>
       <w:pgNumType/>
       <w:docGrid w:linePitch="360"/>
     </w:sectPr>
@@ -658,7 +663,7 @@
       <w:lvlText w:val="–"/>
       <w:lvlJc w:val="left"/>
       <w:pPr>
-        <w:ind w:left="453" w:hanging="283"/>
+        <w:ind w:left="396" w:hanging="226"/>
       </w:pPr>
     </w:lvl>
   </w:abstractNum>
@@ -680,8 +685,18 @@
 <file path=word/styles.xml><?xml version="1.0" encoding="utf-8"?>
 <w:styles xmlns:mc="http://schemas.openxmlformats.org/markup-compatibility/2006" xmlns:r="http://schemas.openxmlformats.org/officeDocument/2006/relationships" xmlns:w="http://schemas.openxmlformats.org/wordprocessingml/2006/main" xmlns:w14="http://schemas.microsoft.com/office/word/2010/wordml" xmlns:w15="http://schemas.microsoft.com/office/word/2012/wordml" mc:Ignorable="w14 w15">
   <w:docDefaults>
-    <w:rPrDefault/>
-    <w:pPrDefault/>
+    <w:rPrDefault>
+      <w:rPr>
+        <w:rFonts w:ascii="Arial" w:cs="Arial" w:eastAsia="Arial" w:hAnsi="Arial"/>
+        <w:sz w:val="22"/>
+        <w:szCs w:val="22"/>
+      </w:rPr>
+    </w:rPrDefault>
+    <w:pPrDefault>
+      <w:pPr>
+        <w:spacing w:after="120" w:line="240" w:lineRule="auto"/>
+      </w:pPr>
+    </w:pPrDefault>
   </w:docDefaults>
   <w:style w:type="paragraph" w:styleId="Title">
     <w:name w:val="Title"/>

</xml_diff>